<commit_message>
Add final report and verified hosted acceptance results
</commit_message>
<xml_diff>
--- a/docs/Gather_Internship_Report.docx
+++ b/docs/Gather_Internship_Report.docx
@@ -481,7 +481,7 @@
           <w:rFonts w:ascii="Roboto Condensed" w:cs="Roboto Condensed" w:eastAsia="Roboto Condensed" w:hAnsi="Roboto Condensed"/>
           <w:rtl w:val="0"/>
         </w:rPr>
-        <w:t>The application uses React and TypeScript, Express and Node.js, Mongoose and MongoDB. Twenty database-backed integration tests and a local browser walkthrough passed. Fictional schedules and identities demonstrate the workflow. The project does not claim institutional adoption or measured improvements in participation.</w:t>
+        <w:t>The application uses React and TypeScript, Express and Node.js, Mongoose and MongoDB. Twenty database-backed integration tests, 24 hosted API checks and local and hosted browser walkthroughs passed. Fictional schedules and identities demonstrate the workflow. The project does not claim institutional adoption or measured improvements in participation.</w:t>
       </w:r>
       <w:r>
         <w:rPr>
@@ -1191,7 +1191,7 @@
           <w:rFonts w:ascii="Roboto Condensed" w:cs="Roboto Condensed" w:eastAsia="Roboto Condensed" w:hAnsi="Roboto Condensed"/>
           <w:rtl w:val="0"/>
         </w:rPr>
-        <w:t>Packaging: documented installation, environment variables, API access, known limitations and demonstration steps. Generated local credentials stay outside Git. The public repository target is https://github.com/adityn09/gather-events. Cloud hosting requires the project owner’s authorized accounts.</w:t>
+        <w:t>Packaging: documented installation, environment variables, API access, known limitations and demonstration steps. Generated credentials stay outside Git. The public repository is https://github.com/adityn09/gather-events. The app is hosted on Render with an Atlas user restricted to its database.</w:t>
       </w:r>
       <w:r>
         <w:rPr>
@@ -1257,7 +1257,7 @@
           <w:rFonts w:ascii="Roboto Condensed" w:cs="Roboto Condensed" w:eastAsia="Roboto Condensed" w:hAnsi="Roboto Condensed"/>
           <w:rtl w:val="0"/>
         </w:rPr>
-        <w:t>The production build completed and all 20 integration tests passed. Tests cover authentication, role escalation attempts, draft privacy, event validation, persisted reservations, duplicate prevention, simultaneous final-seat requests, cancellation ownership, check-in windows, lifecycle rules, CSV escaping, search, pagination, origin checks, logout, production cookies and SPA fallback.</w:t>
+        <w:t>The production build, all 20 integration tests and 24 hosted HTTPS API checks passed. Tests cover authentication, role escalation attempts, draft privacy, event validation, persisted reservations, duplicate prevention, simultaneous final-seat requests, cancellation ownership, check-in windows, lifecycle rules, CSV escaping, search, pagination, origin checks, logout, production cookies and SPA fallback.</w:t>
       </w:r>
       <w:r>
         <w:rPr>
@@ -1288,7 +1288,7 @@
           <w:rFonts w:ascii="Roboto Condensed" w:cs="Roboto Condensed" w:eastAsia="Roboto Condensed" w:hAnsi="Roboto Condensed"/>
           <w:rtl w:val="0"/>
         </w:rPr>
-        <w:t>The browser walkthrough confirmed the student-to-organizer flow and a downloaded attendance CSV. The student’s attended count changed to one after organizer check-in. At the 390 by 844 mobile test, document client width and scroll width both measured 375 CSS pixels, with no document-wide horizontal overflow. The desktop test used 1440 by 1000.</w:t>
+        <w:t>Local and hosted browser walkthroughs confirmed the student-to-organizer flow and a downloaded attendance CSV. The student’s attended count changed to one after organizer check-in. At the 390 by 844 mobile test, document client width and scroll width both measured 375 CSS pixels, with no document-wide horizontal overflow. The desktop test used 1440 by 1000.</w:t>
       </w:r>
       <w:r>
         <w:rPr>
@@ -1319,7 +1319,7 @@
           <w:rFonts w:ascii="Roboto Condensed" w:cs="Roboto Condensed" w:eastAsia="Roboto Condensed" w:hAnsi="Roboto Condensed"/>
           <w:rtl w:val="0"/>
         </w:rPr>
-        <w:t>These results establish the tested local workflow, not institutional effectiveness, sustained cloud availability, concurrent-load performance or independent security certification. External production MongoDB, hosted acceptance and a verified live URL remain delivery tasks.</w:t>
+        <w:t>The hosted app uses Render free compute and MongoDB Atlas in Adithyan’s accounts. Free instances sleep after inactivity and may take 50 seconds or more to wake. The checks do not establish institutional effectiveness, sustained availability, concurrent-load performance or independent security certification.</w:t>
       </w:r>
       <w:r>
         <w:rPr>
@@ -1416,7 +1416,7 @@
           <w:rFonts w:ascii="Roboto Condensed" w:cs="Roboto Condensed" w:eastAsia="Roboto Condensed" w:hAnsi="Roboto Condensed"/>
           <w:rtl w:val="0"/>
         </w:rPr>
-        <w:t>Before submission, Adithyan should review and explain the source, configure production hosting and database access, repeat the core workflow over HTTPS, and add the verified hosted URL. Future work could add verified college membership, notifications, calendar integration, controlled attendance corrections and larger-scale registration storage.</w:t>
+        <w:t>Before submission, Adithyan should review the learning guide, practise explaining the source and demonstration, and confirm the institutional submission details. Future work could add verified college membership, notifications, calendar integration, controlled attendance corrections and larger-scale registration storage.</w:t>
       </w:r>
       <w:r>
         <w:rPr>
@@ -1482,7 +1482,7 @@
           <w:rFonts w:ascii="Roboto Condensed" w:cs="Roboto Condensed" w:eastAsia="Roboto Condensed" w:hAnsi="Roboto Condensed"/>
           <w:rtl w:val="0"/>
         </w:rPr>
-        <w:t>Repository: https://github.com/adityn09/gather-events. Local preview: http://127.0.0.1:5174. A hosted application URL has not yet been created.</w:t>
+        <w:t>Repository: https://github.com/adityn09/gather-events. Hosted application: https://gather-events-adityn09.onrender.com. Local development: http://127.0.0.1:5174.</w:t>
       </w:r>
       <w:r>
         <w:rPr>
@@ -1513,7 +1513,7 @@
           <w:rFonts w:ascii="Roboto Condensed" w:cs="Roboto Condensed" w:eastAsia="Roboto Condensed" w:hAnsi="Roboto Condensed"/>
           <w:rtl w:val="0"/>
         </w:rPr>
-        <w:t>Supporting files: README.md, docs/Gather_SRS.docx, docs/API.md, docs/TEST_RESULTS.md, docs/LEARNING_GUIDE.md, docs/SUBMISSION_CHECKLIST.md, and server/test/api.test.js. Major views below show fictional local demonstration data captured at different stages of the walkthrough.</w:t>
+        <w:t>Supporting files: README.md, docs/Gather_SRS.docx, docs/API.md, docs/TEST_RESULTS.md, docs/LEARNING_GUIDE.md, docs/SUBMISSION_CHECKLIST.md, and server/test/api.test.js. Major views below show fictional hosted demonstration data captured at different stages of the walkthrough.</w:t>
       </w:r>
       <w:r>
         <w:rPr>
@@ -1577,7 +1577,7 @@
         </w:rPr>
         <w:drawing>
           <wp:inline>
-            <wp:extent cx="5852160" cy="4064000"/>
+            <wp:extent cx="5852160" cy="3503168"/>
             <wp:docPr id="2" name="Picture 2"/>
             <wp:cNvGraphicFramePr>
               <a:graphicFrameLocks noChangeAspect="1"/>
@@ -1598,7 +1598,7 @@
                   <pic:spPr>
                     <a:xfrm>
                       <a:off x="0" y="0"/>
-                      <a:ext cx="5852160" cy="4064000"/>
+                      <a:ext cx="5852160" cy="3503168"/>
                     </a:xfrm>
                     <a:prstGeom prst="rect"/>
                   </pic:spPr>
@@ -1670,7 +1670,7 @@
         </w:rPr>
         <w:drawing>
           <wp:inline>
-            <wp:extent cx="5852160" cy="4065711"/>
+            <wp:extent cx="5852160" cy="3503082"/>
             <wp:docPr id="3" name="Picture 3"/>
             <wp:cNvGraphicFramePr>
               <a:graphicFrameLocks noChangeAspect="1"/>
@@ -1691,7 +1691,7 @@
                   <pic:spPr>
                     <a:xfrm>
                       <a:off x="0" y="0"/>
-                      <a:ext cx="5852160" cy="4065711"/>
+                      <a:ext cx="5852160" cy="3503082"/>
                     </a:xfrm>
                     <a:prstGeom prst="rect"/>
                   </pic:spPr>
@@ -1763,7 +1763,7 @@
         </w:rPr>
         <w:drawing>
           <wp:inline>
-            <wp:extent cx="5852160" cy="4065711"/>
+            <wp:extent cx="5852160" cy="3503082"/>
             <wp:docPr id="4" name="Picture 4"/>
             <wp:cNvGraphicFramePr>
               <a:graphicFrameLocks noChangeAspect="1"/>
@@ -1784,7 +1784,7 @@
                   <pic:spPr>
                     <a:xfrm>
                       <a:off x="0" y="0"/>
-                      <a:ext cx="5852160" cy="4065711"/>
+                      <a:ext cx="5852160" cy="3503082"/>
                     </a:xfrm>
                     <a:prstGeom prst="rect"/>
                   </pic:spPr>
@@ -1856,7 +1856,7 @@
         </w:rPr>
         <w:drawing>
           <wp:inline>
-            <wp:extent cx="5852160" cy="4065711"/>
+            <wp:extent cx="5852160" cy="3503082"/>
             <wp:docPr id="5" name="Picture 5"/>
             <wp:cNvGraphicFramePr>
               <a:graphicFrameLocks noChangeAspect="1"/>
@@ -1877,7 +1877,7 @@
                   <pic:spPr>
                     <a:xfrm>
                       <a:off x="0" y="0"/>
-                      <a:ext cx="5852160" cy="4065711"/>
+                      <a:ext cx="5852160" cy="3503082"/>
                     </a:xfrm>
                     <a:prstGeom prst="rect"/>
                   </pic:spPr>
@@ -1949,7 +1949,7 @@
         </w:rPr>
         <w:drawing>
           <wp:inline>
-            <wp:extent cx="5852160" cy="4065711"/>
+            <wp:extent cx="5852160" cy="3503082"/>
             <wp:docPr id="6" name="Picture 6"/>
             <wp:cNvGraphicFramePr>
               <a:graphicFrameLocks noChangeAspect="1"/>
@@ -1970,7 +1970,7 @@
                   <pic:spPr>
                     <a:xfrm>
                       <a:off x="0" y="0"/>
-                      <a:ext cx="5852160" cy="4065711"/>
+                      <a:ext cx="5852160" cy="3503082"/>
                     </a:xfrm>
                     <a:prstGeom prst="rect"/>
                   </pic:spPr>
@@ -2042,7 +2042,7 @@
         </w:rPr>
         <w:drawing>
           <wp:inline>
-            <wp:extent cx="5852160" cy="4065711"/>
+            <wp:extent cx="5852160" cy="3503082"/>
             <wp:docPr id="7" name="Picture 7"/>
             <wp:cNvGraphicFramePr>
               <a:graphicFrameLocks noChangeAspect="1"/>
@@ -2063,7 +2063,7 @@
                   <pic:spPr>
                     <a:xfrm>
                       <a:off x="0" y="0"/>
-                      <a:ext cx="5852160" cy="4065711"/>
+                      <a:ext cx="5852160" cy="3503082"/>
                     </a:xfrm>
                     <a:prstGeom prst="rect"/>
                   </pic:spPr>

</xml_diff>